<commit_message>
Polish SEF manuscript wording and bibliography
</commit_message>
<xml_diff>
--- a/Research_Papers/SEF_v1/Review_IEEE_VERIFIED.docx
+++ b/Research_Papers/SEF_v1/Review_IEEE_VERIFIED.docx
@@ -40,7 +40,7 @@
     </w:p>
     <w:p>
       <w:r>
-        <w:t>We present the Spectral Entropy-Fold (SEF) hypothesis as a geometric program for studying whether structural hardness in NP-complete instances can be expressed through discrete curvature, spectral dispersion, and kernel embeddings. The paper does not claim a proof of P versus NP. Its narrower goal is to formalize a testable bridge: map a weighted problem graph into a reproducing-kernel Hilbert space, measure curvature and spectral regularity on the induced manifold, and ask whether a restricted class of instances thereby acquires optimization-friendly geometry. We define the Entropy-Fold operator, state a Ricci-Convexity Lemma that preserves a spectral-gap lower bound under stated curvature assumptions, and separate what is proved from what remains conjectural.</w:t>
+        <w:t>We formulate the Spectral Entropy-Fold (SEF) hypothesis as a geometric research program for studying whether structural hardness in NP-complete instances can be represented through discrete curvature, spectral dispersion, and kernel embeddings. The manuscript does not claim a resolution of P versus NP. Its more limited aim is to define a testable bridge: construct a weighted problem graph, embed that graph into a reproducing-kernel Hilbert space, measure curvature and spectral regularity on the induced manifold, and determine whether a restricted instance class thereby acquires optimization-friendly geometry. We define the Entropy-Fold operator, state a conditional Ricci-Convexity Lemma preserving a spectral-gap lower bound under explicit curvature hypotheses, distinguish proved statements from conjectural implications, and specify measurable claims, falsifiers, and validation criteria.</w:t>
       </w:r>
     </w:p>
     <w:p>
@@ -53,7 +53,7 @@
     </w:p>
     <w:p>
       <w:r>
-        <w:t>The P versus NP problem remains one of the central unresolved questions in theoretical computer science. The SEF program studies whether certain geometric summaries of hard instances can serve as structural witnesses of difficulty. The framework combines discrete Ricci curvature, spectral graph theory, and information geometry, but it is framed as a falsifiable research program rather than as a completed class-separation proof.</w:t>
+        <w:t>The P versus NP problem remains unresolved, and several barrier results explain why broad classes of familiar proof techniques are unlikely to suffice. The SEF program responds by isolating structural properties of instances rather than by asserting a direct class-separation argument. The guiding question is whether a useful portion of computational hardness can be represented geometrically through curvature and spectral regularity.</w:t>
       </w:r>
     </w:p>
     <w:p>
@@ -66,12 +66,7 @@
     </w:p>
     <w:p>
       <w:r>
-        <w:t>Let x be an NP-complete instance and let G_x = (V_x, E_x, w_x) be its weighted problem graph. The normalized Laplacian is L_x = I - D_x^{-1/2} A_x D_x^{-1/2}, with spectral gap lambda_2. The spectral entropy is defined by H(G_x) = - sum_i (lambda_i / Z_x) log(lambda_i / Z_x), where Z_x is the nonzero eigenvalue sum.</w:t>
-      </w:r>
-    </w:p>
-    <w:p>
-      <w:r>
-        <w:t>The Entropy-Fold operator Phi_S maps graph descriptors into an RKHS using a Gaussian kernel and a finite-dimensional kernel-PCA representation. The embedded manifold M_x = Phi_S(G_x) is the object on which curvature and optimization structure are studied.</w:t>
+        <w:t>For an instance x, let G_x = (V_x, E_x, w_x) denote a weighted problem graph. The normalized Laplacian is L_x = I - D_x^{-1/2} A_x D_x^{-1/2}, with spectral gap lambda_2. The spectral entropy is H(G_x) = - sum_i (lambda_i / Z_x) log(lambda_i / Z_x), where Z_x is the nonzero eigenvalue sum. The Entropy-Fold operator Phi_S maps graph descriptors into an RKHS by a Gaussian-kernel KPCA construction, yielding an embedded manifold M_x and an induced objective f_x.</w:t>
       </w:r>
     </w:p>
     <w:p>
@@ -84,7 +79,7 @@
     </w:p>
     <w:p>
       <w:r>
-        <w:t>The framework assumes embedding access, curvature estimability, and objective compatibility. The current manuscript proves a conditional Ricci-Convexity Lemma, but the optimization consequences remain conjectural. Practical verification of the curvature-dimension condition for interesting NP-complete families is still open.</w:t>
+        <w:t>The framework assumes embedding access, curvature estimability, and objective compatibility. The current manuscript proves a conditional regularity statement, not an optimization theorem. The optimization consequence remains conjectural, and practical verification of the relevant curvature-dimension regime for nontrivial NP-complete families remains open.</w:t>
       </w:r>
     </w:p>
     <w:p>
@@ -97,12 +92,7 @@
     </w:p>
     <w:p>
       <w:r>
-        <w:t>Lemma. Let M_x = Phi_S(G_x) satisfy a Bakry-Emery curvature-dimension condition CD(0,d), and assume the initial Laplace-Beltrami spectral gap is bounded below by eta &gt; 0. Then under normalized Ricci flow, the spectral-gap lower bound is preserved up to embedding-approximation error.</w:t>
-      </w:r>
-    </w:p>
-    <w:p>
-      <w:r>
-        <w:t>Interpretation. This lemma preserves diffusion regularity under the stated curvature assumptions. It is not yet a theorem about polynomial-time optimization.</w:t>
+        <w:t>Lemma. Let M_x = Phi_S(G_x) be compact, let the induced diffusion operator satisfy a Bakry-Emery curvature-dimension condition, and let the initial Laplace-Beltrami spectral gap be bounded below by eta &gt; 0. Then every normalized Ricci-flow trajectory in this regime preserves the spectral-gap lower bound up to embedding distortion. This is a regularity statement, not a theorem of polynomial-time optimization.</w:t>
       </w:r>
     </w:p>
     <w:p>
@@ -110,12 +100,12 @@
         <w:pStyle w:val="Heading1"/>
       </w:pPr>
       <w:r>
-        <w:t>5. The SEF Conjecture</w:t>
+        <w:t>5. Conjectural Optimization Implication</w:t>
       </w:r>
     </w:p>
     <w:p>
       <w:r>
-        <w:t>Conjectural bridge. There may exist a polynomial-time computable family of embeddings for which instances satisfying the curvature and regularity premises admit polynomial-time global optimization in the embedded space. The crucial missing step is the bridge from spectral regularity and curvature control to guaranteed optimization performance.</w:t>
+        <w:t>The conjectural SEF optimization implication states that if a polynomial-time computable embedding family exists, if the embedded manifold satisfies the required curvature regime, and if the embedded objective has no non-global critical structure capable of trapping admissible descent trajectories for superpolynomial time, then one may conjecture polynomial-time global optimization. The importance of this statement lies in exposing the missing implication precisely rather than in overstating what is known.</w:t>
       </w:r>
     </w:p>
     <w:p>
@@ -128,7 +118,7 @@
     </w:p>
     <w:p>
       <w:r>
-        <w:t>A useful SEF study should estimate curvature summaries on finite instance families, compare them against solver cost, and test whether the observed association survives controls for density, size, and ordinary expansion. The framework is strengthened only if within-family evidence remains stable and is not reducible to simpler graph statistics.</w:t>
+        <w:t>A serious SEF study should examine within-family associations between estimated curvature irregularity and solver cost while controlling for size, density, and baseline spectral covariates. The framework is strengthened only if such associations remain stable under repeated estimation and are not reducible to simpler graph statistics.</w:t>
       </w:r>
     </w:p>
     <w:p>
@@ -141,7 +131,7 @@
     </w:p>
     <w:p>
       <w:r>
-        <w:t>The framework weakens if curvature estimates are unstable, if no family-level hardness association survives controls, or if hard counterexamples satisfy all stated geometric premises. A negative result is scientifically meaningful inside this program, because the framework is useful only if it stays falsifiable.</w:t>
+        <w:t>The SEF program weakens if curvature summaries are unstable, if family-level associations disappear after controls, or if hard counterexample families satisfy the geometric premises without yielding any optimization advantage. The framework is useful only if it remains computationally grounded and genuinely falsifiable.</w:t>
       </w:r>
     </w:p>
     <w:p>
@@ -154,7 +144,7 @@
     </w:p>
     <w:p>
       <w:r>
-        <w:t>The current version does not demonstrate the curvature condition on a nontrivial NP-complete family, does not close the gap from mixing to optimization, and does not yet control embedding distortion sharply enough for a final theorem. Immediate next steps are computational curvature studies on 3-SAT, Max-Clique, and graph-coloring families, comparison against simpler baselines, and barrier analysis for the geometric program itself.</w:t>
+        <w:t>The curvature condition is still assumed rather than demonstrated for a nontrivial NP-complete family; the bridge from spectral regularity to polynomial-time optimization remains open; and embedding distortion still requires tighter control. Immediate next steps are finite-instance curvature studies, comparative tests against simpler baselines, and barrier analysis for the geometric program itself.</w:t>
       </w:r>
     </w:p>
     <w:p>
@@ -167,7 +157,7 @@
     </w:p>
     <w:p>
       <w:r>
-        <w:t>The accompanying Springer LaTeX package in SEF_v1/submission_package contains the full bibliography and the citable journal-style manuscript source.</w:t>
+        <w:t>The canonical Springer-style version, complete bibliography, and compile-ready source package are provided in SEF_v1/submission_package.</w:t>
       </w:r>
     </w:p>
     <w:sectPr>

</xml_diff>